<commit_message>
Added CI and medians on Ebola case study
</commit_message>
<xml_diff>
--- a/Ebola_DRC_2018/DSA_turing_SIRmap_W1.docx
+++ b/Ebola_DRC_2018/DSA_turing_SIRmap_W1.docx
@@ -7547,7 +7547,7 @@
         <w:rPr>
           <w:rStyle w:val="VerbatimChar"/>
         </w:rPr>
-        <w:t xml:space="preserve">Wall duration     = 1881.72 seconds</w:t>
+        <w:t xml:space="preserve">Wall duration     = 1906.1 seconds</w:t>
       </w:r>
       <w:r>
         <w:br/>
@@ -7556,7 +7556,7 @@
         <w:rPr>
           <w:rStyle w:val="VerbatimChar"/>
         </w:rPr>
-        <w:t xml:space="preserve">Compute duration  = 5105.48 seconds</w:t>
+        <w:t xml:space="preserve">Compute duration  = 5148.76 seconds</w:t>
       </w:r>
       <w:r>
         <w:br/>
@@ -7795,25 +7795,25 @@
         <w:rPr>
           <w:rStyle w:val="NormalTok"/>
         </w:rPr>
-        <w:t xml:space="preserve">β_mean </w:t>
-      </w:r>
-      <w:r>
-        <w:rPr>
-          <w:rStyle w:val="OperatorTok"/>
-        </w:rPr>
-        <w:t xml:space="preserve">=</w:t>
-      </w:r>
-      <w:r>
-        <w:rPr>
-          <w:rStyle w:val="NormalTok"/>
-        </w:rPr>
-        <w:t xml:space="preserve"> </w:t>
-      </w:r>
-      <w:r>
-        <w:rPr>
-          <w:rStyle w:val="FunctionTok"/>
-        </w:rPr>
-        <w:t xml:space="preserve">mean</w:t>
+        <w:t xml:space="preserve">β_med </w:t>
+      </w:r>
+      <w:r>
+        <w:rPr>
+          <w:rStyle w:val="OperatorTok"/>
+        </w:rPr>
+        <w:t xml:space="preserve">=</w:t>
+      </w:r>
+      <w:r>
+        <w:rPr>
+          <w:rStyle w:val="NormalTok"/>
+        </w:rPr>
+        <w:t xml:space="preserve"> </w:t>
+      </w:r>
+      <w:r>
+        <w:rPr>
+          <w:rStyle w:val="FunctionTok"/>
+        </w:rPr>
+        <w:t xml:space="preserve">median</w:t>
       </w:r>
       <w:r>
         <w:rPr>
@@ -7840,25 +7840,25 @@
         <w:rPr>
           <w:rStyle w:val="NormalTok"/>
         </w:rPr>
-        <w:t xml:space="preserve">γ_mean </w:t>
-      </w:r>
-      <w:r>
-        <w:rPr>
-          <w:rStyle w:val="OperatorTok"/>
-        </w:rPr>
-        <w:t xml:space="preserve">=</w:t>
-      </w:r>
-      <w:r>
-        <w:rPr>
-          <w:rStyle w:val="NormalTok"/>
-        </w:rPr>
-        <w:t xml:space="preserve"> </w:t>
-      </w:r>
-      <w:r>
-        <w:rPr>
-          <w:rStyle w:val="FunctionTok"/>
-        </w:rPr>
-        <w:t xml:space="preserve">mean</w:t>
+        <w:t xml:space="preserve">γ_med </w:t>
+      </w:r>
+      <w:r>
+        <w:rPr>
+          <w:rStyle w:val="OperatorTok"/>
+        </w:rPr>
+        <w:t xml:space="preserve">=</w:t>
+      </w:r>
+      <w:r>
+        <w:rPr>
+          <w:rStyle w:val="NormalTok"/>
+        </w:rPr>
+        <w:t xml:space="preserve"> </w:t>
+      </w:r>
+      <w:r>
+        <w:rPr>
+          <w:rStyle w:val="FunctionTok"/>
+        </w:rPr>
+        <w:t xml:space="preserve">median</w:t>
       </w:r>
       <w:r>
         <w:rPr>
@@ -7885,25 +7885,25 @@
         <w:rPr>
           <w:rStyle w:val="NormalTok"/>
         </w:rPr>
-        <w:t xml:space="preserve">ρ_mean </w:t>
-      </w:r>
-      <w:r>
-        <w:rPr>
-          <w:rStyle w:val="OperatorTok"/>
-        </w:rPr>
-        <w:t xml:space="preserve">=</w:t>
-      </w:r>
-      <w:r>
-        <w:rPr>
-          <w:rStyle w:val="NormalTok"/>
-        </w:rPr>
-        <w:t xml:space="preserve"> </w:t>
-      </w:r>
-      <w:r>
-        <w:rPr>
-          <w:rStyle w:val="FunctionTok"/>
-        </w:rPr>
-        <w:t xml:space="preserve">mean</w:t>
+        <w:t xml:space="preserve">ρ_med </w:t>
+      </w:r>
+      <w:r>
+        <w:rPr>
+          <w:rStyle w:val="OperatorTok"/>
+        </w:rPr>
+        <w:t xml:space="preserve">=</w:t>
+      </w:r>
+      <w:r>
+        <w:rPr>
+          <w:rStyle w:val="NormalTok"/>
+        </w:rPr>
+        <w:t xml:space="preserve"> </w:t>
+      </w:r>
+      <w:r>
+        <w:rPr>
+          <w:rStyle w:val="FunctionTok"/>
+        </w:rPr>
+        <w:t xml:space="preserve">median</w:t>
       </w:r>
       <w:r>
         <w:rPr>
@@ -7930,25 +7930,25 @@
         <w:rPr>
           <w:rStyle w:val="NormalTok"/>
         </w:rPr>
-        <w:t xml:space="preserve">N_mean </w:t>
-      </w:r>
-      <w:r>
-        <w:rPr>
-          <w:rStyle w:val="OperatorTok"/>
-        </w:rPr>
-        <w:t xml:space="preserve">=</w:t>
-      </w:r>
-      <w:r>
-        <w:rPr>
-          <w:rStyle w:val="NormalTok"/>
-        </w:rPr>
-        <w:t xml:space="preserve"> </w:t>
-      </w:r>
-      <w:r>
-        <w:rPr>
-          <w:rStyle w:val="FunctionTok"/>
-        </w:rPr>
-        <w:t xml:space="preserve">mean</w:t>
+        <w:t xml:space="preserve">N_med </w:t>
+      </w:r>
+      <w:r>
+        <w:rPr>
+          <w:rStyle w:val="OperatorTok"/>
+        </w:rPr>
+        <w:t xml:space="preserve">=</w:t>
+      </w:r>
+      <w:r>
+        <w:rPr>
+          <w:rStyle w:val="NormalTok"/>
+        </w:rPr>
+        <w:t xml:space="preserve"> </w:t>
+      </w:r>
+      <w:r>
+        <w:rPr>
+          <w:rStyle w:val="FunctionTok"/>
+        </w:rPr>
+        <w:t xml:space="preserve">median</w:t>
       </w:r>
       <w:r>
         <w:rPr>
@@ -8179,7 +8179,7 @@
         <w:rPr>
           <w:rStyle w:val="NormalTok"/>
         </w:rPr>
-        <w:t xml:space="preserve">(p1, [β_mean], label</w:t>
+        <w:t xml:space="preserve">(p1, [β_med], label</w:t>
       </w:r>
       <w:r>
         <w:rPr>
@@ -8191,7 +8191,7 @@
         <w:rPr>
           <w:rStyle w:val="StringTok"/>
         </w:rPr>
-        <w:t xml:space="preserve">"Posterior mean"</w:t>
+        <w:t xml:space="preserve">"Posterior median"</w:t>
       </w:r>
       <w:r>
         <w:rPr>
@@ -8443,7 +8443,7 @@
         <w:rPr>
           <w:rStyle w:val="NormalTok"/>
         </w:rPr>
-        <w:t xml:space="preserve">(p2, [γ_mean], label</w:t>
+        <w:t xml:space="preserve">(p2, [γ_med], label</w:t>
       </w:r>
       <w:r>
         <w:rPr>
@@ -8455,7 +8455,7 @@
         <w:rPr>
           <w:rStyle w:val="StringTok"/>
         </w:rPr>
-        <w:t xml:space="preserve">"Posterior mean"</w:t>
+        <w:t xml:space="preserve">"Posterior median"</w:t>
       </w:r>
       <w:r>
         <w:rPr>
@@ -8707,7 +8707,7 @@
         <w:rPr>
           <w:rStyle w:val="NormalTok"/>
         </w:rPr>
-        <w:t xml:space="preserve">(p3, [ρ_mean], label</w:t>
+        <w:t xml:space="preserve">(p3, [ρ_med], label</w:t>
       </w:r>
       <w:r>
         <w:rPr>
@@ -8719,7 +8719,7 @@
         <w:rPr>
           <w:rStyle w:val="StringTok"/>
         </w:rPr>
-        <w:t xml:space="preserve">"Posterior mean"</w:t>
+        <w:t xml:space="preserve">"Posterior median"</w:t>
       </w:r>
       <w:r>
         <w:rPr>
@@ -8911,7 +8911,7 @@
         <w:rPr>
           <w:rStyle w:val="NormalTok"/>
         </w:rPr>
-        <w:t xml:space="preserve">(p4, [N_mean], label</w:t>
+        <w:t xml:space="preserve">(p4, [N_med], label</w:t>
       </w:r>
       <w:r>
         <w:rPr>
@@ -8923,7 +8923,7 @@
         <w:rPr>
           <w:rStyle w:val="StringTok"/>
         </w:rPr>
-        <w:t xml:space="preserve">"Posterior mean"</w:t>
+        <w:t xml:space="preserve">"Posterior median"</w:t>
       </w:r>
       <w:r>
         <w:rPr>
@@ -9053,7 +9053,7 @@
       <w:r>
         <w:drawing>
           <wp:inline>
-            <wp:extent cx="5029200" cy="3200400"/>
+            <wp:extent cx="5334000" cy="3810000"/>
             <wp:effectExtent b="0" l="0" r="0" t="0"/>
             <wp:docPr descr="" title="" id="29" name="Picture"/>
             <a:graphic>
@@ -9083,7 +9083,7 @@
                   <pic:spPr bwMode="auto">
                     <a:xfrm>
                       <a:off x="0" y="0"/>
-                      <a:ext cx="5029200" cy="3200400"/>
+                      <a:ext cx="5334000" cy="3810000"/>
                     </a:xfrm>
                     <a:prstGeom prst="rect">
                       <a:avLst/>
@@ -9225,18 +9225,1333 @@
       </w:pPr>
       <w:r>
         <w:rPr>
+          <w:rStyle w:val="NormalTok"/>
+        </w:rPr>
+        <w:t xml:space="preserve">β_chain  </w:t>
+      </w:r>
+      <w:r>
+        <w:rPr>
+          <w:rStyle w:val="OperatorTok"/>
+        </w:rPr>
+        <w:t xml:space="preserve">=</w:t>
+      </w:r>
+      <w:r>
+        <w:rPr>
+          <w:rStyle w:val="NormalTok"/>
+        </w:rPr>
+        <w:t xml:space="preserve"> </w:t>
+      </w:r>
+      <w:r>
+        <w:rPr>
+          <w:rStyle w:val="FunctionTok"/>
+        </w:rPr>
+        <w:t xml:space="preserve">vec</w:t>
+      </w:r>
+      <w:r>
+        <w:rPr>
+          <w:rStyle w:val="NormalTok"/>
+        </w:rPr>
+        <w:t xml:space="preserve">(chain[</w:t>
+      </w:r>
+      <w:r>
+        <w:rPr>
+          <w:rStyle w:val="OperatorTok"/>
+        </w:rPr>
+        <w:t xml:space="preserve">:</w:t>
+      </w:r>
+      <w:r>
+        <w:rPr>
+          <w:rStyle w:val="NormalTok"/>
+        </w:rPr>
+        <w:t xml:space="preserve">β])</w:t>
+      </w:r>
+      <w:r>
+        <w:br/>
+      </w:r>
+      <w:r>
+        <w:rPr>
+          <w:rStyle w:val="NormalTok"/>
+        </w:rPr>
+        <w:t xml:space="preserve">γ_chain  </w:t>
+      </w:r>
+      <w:r>
+        <w:rPr>
+          <w:rStyle w:val="OperatorTok"/>
+        </w:rPr>
+        <w:t xml:space="preserve">=</w:t>
+      </w:r>
+      <w:r>
+        <w:rPr>
+          <w:rStyle w:val="NormalTok"/>
+        </w:rPr>
+        <w:t xml:space="preserve"> </w:t>
+      </w:r>
+      <w:r>
+        <w:rPr>
+          <w:rStyle w:val="FunctionTok"/>
+        </w:rPr>
+        <w:t xml:space="preserve">vec</w:t>
+      </w:r>
+      <w:r>
+        <w:rPr>
+          <w:rStyle w:val="NormalTok"/>
+        </w:rPr>
+        <w:t xml:space="preserve">(chain[</w:t>
+      </w:r>
+      <w:r>
+        <w:rPr>
+          <w:rStyle w:val="OperatorTok"/>
+        </w:rPr>
+        <w:t xml:space="preserve">:</w:t>
+      </w:r>
+      <w:r>
+        <w:rPr>
+          <w:rStyle w:val="NormalTok"/>
+        </w:rPr>
+        <w:t xml:space="preserve">γ])</w:t>
+      </w:r>
+      <w:r>
+        <w:br/>
+      </w:r>
+      <w:r>
+        <w:rPr>
+          <w:rStyle w:val="NormalTok"/>
+        </w:rPr>
+        <w:t xml:space="preserve">ρ_chain  </w:t>
+      </w:r>
+      <w:r>
+        <w:rPr>
+          <w:rStyle w:val="OperatorTok"/>
+        </w:rPr>
+        <w:t xml:space="preserve">=</w:t>
+      </w:r>
+      <w:r>
+        <w:rPr>
+          <w:rStyle w:val="NormalTok"/>
+        </w:rPr>
+        <w:t xml:space="preserve"> </w:t>
+      </w:r>
+      <w:r>
+        <w:rPr>
+          <w:rStyle w:val="FunctionTok"/>
+        </w:rPr>
+        <w:t xml:space="preserve">vec</w:t>
+      </w:r>
+      <w:r>
+        <w:rPr>
+          <w:rStyle w:val="NormalTok"/>
+        </w:rPr>
+        <w:t xml:space="preserve">(chain[</w:t>
+      </w:r>
+      <w:r>
+        <w:rPr>
+          <w:rStyle w:val="OperatorTok"/>
+        </w:rPr>
+        <w:t xml:space="preserve">:</w:t>
+      </w:r>
+      <w:r>
+        <w:rPr>
+          <w:rStyle w:val="NormalTok"/>
+        </w:rPr>
+        <w:t xml:space="preserve">ρ])</w:t>
+      </w:r>
+      <w:r>
+        <w:br/>
+      </w:r>
+      <w:r>
+        <w:rPr>
+          <w:rStyle w:val="NormalTok"/>
+        </w:rPr>
+        <w:t xml:space="preserve">N_chain  </w:t>
+      </w:r>
+      <w:r>
+        <w:rPr>
+          <w:rStyle w:val="OperatorTok"/>
+        </w:rPr>
+        <w:t xml:space="preserve">=</w:t>
+      </w:r>
+      <w:r>
+        <w:rPr>
+          <w:rStyle w:val="NormalTok"/>
+        </w:rPr>
+        <w:t xml:space="preserve"> </w:t>
+      </w:r>
+      <w:r>
+        <w:rPr>
+          <w:rStyle w:val="FunctionTok"/>
+        </w:rPr>
+        <w:t xml:space="preserve">vec</w:t>
+      </w:r>
+      <w:r>
+        <w:rPr>
+          <w:rStyle w:val="NormalTok"/>
+        </w:rPr>
+        <w:t xml:space="preserve">(chain[</w:t>
+      </w:r>
+      <w:r>
+        <w:rPr>
+          <w:rStyle w:val="OperatorTok"/>
+        </w:rPr>
+        <w:t xml:space="preserve">:</w:t>
+      </w:r>
+      <w:r>
+        <w:rPr>
+          <w:rStyle w:val="NormalTok"/>
+        </w:rPr>
+        <w:t xml:space="preserve">N_float])</w:t>
+      </w:r>
+      <w:r>
+        <w:br/>
+      </w:r>
+      <w:r>
+        <w:rPr>
+          <w:rStyle w:val="NormalTok"/>
+        </w:rPr>
+        <w:t xml:space="preserve">pγ_chain </w:t>
+      </w:r>
+      <w:r>
+        <w:rPr>
+          <w:rStyle w:val="OperatorTok"/>
+        </w:rPr>
+        <w:t xml:space="preserve">=</w:t>
+      </w:r>
+      <w:r>
+        <w:rPr>
+          <w:rStyle w:val="NormalTok"/>
+        </w:rPr>
+        <w:t xml:space="preserve"> </w:t>
+      </w:r>
+      <w:r>
+        <w:rPr>
+          <w:rStyle w:val="FunctionTok"/>
+        </w:rPr>
+        <w:t xml:space="preserve">rate_to_proportion</w:t>
+      </w:r>
+      <w:r>
+        <w:rPr>
+          <w:rStyle w:val="NormalTok"/>
+        </w:rPr>
+        <w:t xml:space="preserve">.(γ_chain)</w:t>
+      </w:r>
+      <w:r>
+        <w:br/>
+      </w:r>
+      <w:r>
+        <w:br/>
+      </w:r>
+      <w:r>
+        <w:rPr>
+          <w:rStyle w:val="NormalTok"/>
+        </w:rPr>
+        <w:t xml:space="preserve">R0_chain       </w:t>
+      </w:r>
+      <w:r>
+        <w:rPr>
+          <w:rStyle w:val="OperatorTok"/>
+        </w:rPr>
+        <w:t xml:space="preserve">=</w:t>
+      </w:r>
+      <w:r>
+        <w:rPr>
+          <w:rStyle w:val="NormalTok"/>
+        </w:rPr>
+        <w:t xml:space="preserve"> β_chain </w:t>
+      </w:r>
+      <w:r>
+        <w:rPr>
+          <w:rStyle w:val="OperatorTok"/>
+        </w:rPr>
+        <w:t xml:space="preserve">./</w:t>
+      </w:r>
+      <w:r>
+        <w:rPr>
+          <w:rStyle w:val="NormalTok"/>
+        </w:rPr>
+        <w:t xml:space="preserve"> pγ_chain           </w:t>
+      </w:r>
+      <w:r>
+        <w:rPr>
+          <w:rStyle w:val="CommentTok"/>
+        </w:rPr>
+        <w:t xml:space="preserve"># R0 of the discrete process</w:t>
+      </w:r>
+      <w:r>
+        <w:br/>
+      </w:r>
+      <w:r>
+        <w:rPr>
+          <w:rStyle w:val="NormalTok"/>
+        </w:rPr>
+        <w:t xml:space="preserve">IP_steps_chain </w:t>
+      </w:r>
+      <w:r>
+        <w:rPr>
+          <w:rStyle w:val="OperatorTok"/>
+        </w:rPr>
+        <w:t xml:space="preserve">=</w:t>
+      </w:r>
+      <w:r>
+        <w:rPr>
+          <w:rStyle w:val="NormalTok"/>
+        </w:rPr>
+        <w:t xml:space="preserve"> </w:t>
+      </w:r>
+      <w:r>
+        <w:rPr>
+          <w:rStyle w:val="FloatTok"/>
+        </w:rPr>
+        <w:t xml:space="preserve">1</w:t>
+      </w:r>
+      <w:r>
+        <w:rPr>
+          <w:rStyle w:val="NormalTok"/>
+        </w:rPr>
+        <w:t xml:space="preserve"> </w:t>
+      </w:r>
+      <w:r>
+        <w:rPr>
+          <w:rStyle w:val="OperatorTok"/>
+        </w:rPr>
+        <w:t xml:space="preserve">./</w:t>
+      </w:r>
+      <w:r>
+        <w:rPr>
+          <w:rStyle w:val="NormalTok"/>
+        </w:rPr>
+        <w:t xml:space="preserve"> pγ_chain                 </w:t>
+      </w:r>
+      <w:r>
+        <w:rPr>
+          <w:rStyle w:val="CommentTok"/>
+        </w:rPr>
+        <w:t xml:space="preserve"># mean infectious period in steps (1-indexed Geometric)</w:t>
+      </w:r>
+      <w:r>
+        <w:br/>
+      </w:r>
+      <w:r>
+        <w:rPr>
+          <w:rStyle w:val="NormalTok"/>
+        </w:rPr>
+        <w:t xml:space="preserve">I0_chain       </w:t>
+      </w:r>
+      <w:r>
+        <w:rPr>
+          <w:rStyle w:val="OperatorTok"/>
+        </w:rPr>
+        <w:t xml:space="preserve">=</w:t>
+      </w:r>
+      <w:r>
+        <w:rPr>
+          <w:rStyle w:val="NormalTok"/>
+        </w:rPr>
+        <w:t xml:space="preserve"> ρ_chain </w:t>
+      </w:r>
+      <w:r>
+        <w:rPr>
+          <w:rStyle w:val="OperatorTok"/>
+        </w:rPr>
+        <w:t xml:space="preserve">.*</w:t>
+      </w:r>
+      <w:r>
+        <w:rPr>
+          <w:rStyle w:val="NormalTok"/>
+        </w:rPr>
+        <w:t xml:space="preserve"> N_chain            </w:t>
+      </w:r>
+      <w:r>
+        <w:rPr>
+          <w:rStyle w:val="CommentTok"/>
+        </w:rPr>
+        <w:t xml:space="preserve"># implied initial infected count</w:t>
+      </w:r>
+      <w:r>
+        <w:br/>
+      </w:r>
+      <w:r>
+        <w:rPr>
+          <w:rStyle w:val="NormalTok"/>
+        </w:rPr>
+        <w:t xml:space="preserve">tau_chain      </w:t>
+      </w:r>
+      <w:r>
+        <w:rPr>
+          <w:rStyle w:val="OperatorTok"/>
+        </w:rPr>
+        <w:t xml:space="preserve">=</w:t>
+      </w:r>
+      <w:r>
+        <w:rPr>
+          <w:rStyle w:val="NormalTok"/>
+        </w:rPr>
+        <w:t xml:space="preserve"> K_total </w:t>
+      </w:r>
+      <w:r>
+        <w:rPr>
+          <w:rStyle w:val="OperatorTok"/>
+        </w:rPr>
+        <w:t xml:space="preserve">./</w:t>
+      </w:r>
+      <w:r>
+        <w:rPr>
+          <w:rStyle w:val="NormalTok"/>
+        </w:rPr>
+        <w:t xml:space="preserve"> N_chain            </w:t>
+      </w:r>
+      <w:r>
+        <w:rPr>
+          <w:rStyle w:val="CommentTok"/>
+        </w:rPr>
+        <w:t xml:space="preserve"># observed attack rate posterior</w:t>
+      </w:r>
+      <w:r>
+        <w:br/>
+      </w:r>
+      <w:r>
+        <w:br/>
+      </w:r>
+      <w:r>
+        <w:rPr>
+          <w:rStyle w:val="CommentTok"/>
+        </w:rPr>
+        <w:t xml:space="preserve"># Posterior point estimates (medians)</w:t>
+      </w:r>
+      <w:r>
+        <w:br/>
+      </w:r>
+      <w:r>
+        <w:rPr>
+          <w:rStyle w:val="NormalTok"/>
+        </w:rPr>
+        <w:t xml:space="preserve">β_post  </w:t>
+      </w:r>
+      <w:r>
+        <w:rPr>
+          <w:rStyle w:val="OperatorTok"/>
+        </w:rPr>
+        <w:t xml:space="preserve">=</w:t>
+      </w:r>
+      <w:r>
+        <w:rPr>
+          <w:rStyle w:val="NormalTok"/>
+        </w:rPr>
+        <w:t xml:space="preserve"> </w:t>
+      </w:r>
+      <w:r>
+        <w:rPr>
+          <w:rStyle w:val="FunctionTok"/>
+        </w:rPr>
+        <w:t xml:space="preserve">median</w:t>
+      </w:r>
+      <w:r>
+        <w:rPr>
+          <w:rStyle w:val="NormalTok"/>
+        </w:rPr>
+        <w:t xml:space="preserve">(β_chain)</w:t>
+      </w:r>
+      <w:r>
+        <w:br/>
+      </w:r>
+      <w:r>
+        <w:rPr>
+          <w:rStyle w:val="NormalTok"/>
+        </w:rPr>
+        <w:t xml:space="preserve">γ_post  </w:t>
+      </w:r>
+      <w:r>
+        <w:rPr>
+          <w:rStyle w:val="OperatorTok"/>
+        </w:rPr>
+        <w:t xml:space="preserve">=</w:t>
+      </w:r>
+      <w:r>
+        <w:rPr>
+          <w:rStyle w:val="NormalTok"/>
+        </w:rPr>
+        <w:t xml:space="preserve"> </w:t>
+      </w:r>
+      <w:r>
+        <w:rPr>
+          <w:rStyle w:val="FunctionTok"/>
+        </w:rPr>
+        <w:t xml:space="preserve">median</w:t>
+      </w:r>
+      <w:r>
+        <w:rPr>
+          <w:rStyle w:val="NormalTok"/>
+        </w:rPr>
+        <w:t xml:space="preserve">(γ_chain)</w:t>
+      </w:r>
+      <w:r>
+        <w:br/>
+      </w:r>
+      <w:r>
+        <w:rPr>
+          <w:rStyle w:val="NormalTok"/>
+        </w:rPr>
+        <w:t xml:space="preserve">ρ_post  </w:t>
+      </w:r>
+      <w:r>
+        <w:rPr>
+          <w:rStyle w:val="OperatorTok"/>
+        </w:rPr>
+        <w:t xml:space="preserve">=</w:t>
+      </w:r>
+      <w:r>
+        <w:rPr>
+          <w:rStyle w:val="NormalTok"/>
+        </w:rPr>
+        <w:t xml:space="preserve"> </w:t>
+      </w:r>
+      <w:r>
+        <w:rPr>
+          <w:rStyle w:val="FunctionTok"/>
+        </w:rPr>
+        <w:t xml:space="preserve">median</w:t>
+      </w:r>
+      <w:r>
+        <w:rPr>
+          <w:rStyle w:val="NormalTok"/>
+        </w:rPr>
+        <w:t xml:space="preserve">(ρ_chain)</w:t>
+      </w:r>
+      <w:r>
+        <w:br/>
+      </w:r>
+      <w:r>
+        <w:rPr>
+          <w:rStyle w:val="NormalTok"/>
+        </w:rPr>
+        <w:t xml:space="preserve">N_post  </w:t>
+      </w:r>
+      <w:r>
+        <w:rPr>
+          <w:rStyle w:val="OperatorTok"/>
+        </w:rPr>
+        <w:t xml:space="preserve">=</w:t>
+      </w:r>
+      <w:r>
+        <w:rPr>
+          <w:rStyle w:val="NormalTok"/>
+        </w:rPr>
+        <w:t xml:space="preserve"> </w:t>
+      </w:r>
+      <w:r>
+        <w:rPr>
+          <w:rStyle w:val="FunctionTok"/>
+        </w:rPr>
+        <w:t xml:space="preserve">median</w:t>
+      </w:r>
+      <w:r>
+        <w:rPr>
+          <w:rStyle w:val="NormalTok"/>
+        </w:rPr>
+        <w:t xml:space="preserve">(N_chain)</w:t>
+      </w:r>
+      <w:r>
+        <w:br/>
+      </w:r>
+      <w:r>
+        <w:rPr>
+          <w:rStyle w:val="NormalTok"/>
+        </w:rPr>
+        <w:t xml:space="preserve">pγ_post </w:t>
+      </w:r>
+      <w:r>
+        <w:rPr>
+          <w:rStyle w:val="OperatorTok"/>
+        </w:rPr>
+        <w:t xml:space="preserve">=</w:t>
+      </w:r>
+      <w:r>
+        <w:rPr>
+          <w:rStyle w:val="NormalTok"/>
+        </w:rPr>
+        <w:t xml:space="preserve"> </w:t>
+      </w:r>
+      <w:r>
+        <w:rPr>
+          <w:rStyle w:val="FunctionTok"/>
+        </w:rPr>
+        <w:t xml:space="preserve">rate_to_proportion</w:t>
+      </w:r>
+      <w:r>
+        <w:rPr>
+          <w:rStyle w:val="NormalTok"/>
+        </w:rPr>
+        <w:t xml:space="preserve">(γ_post)</w:t>
+      </w:r>
+      <w:r>
+        <w:br/>
+      </w:r>
+      <w:r>
+        <w:br/>
+      </w:r>
+      <w:r>
+        <w:rPr>
+          <w:rStyle w:val="KeywordTok"/>
+        </w:rPr>
+        <w:t xml:space="preserve">function</w:t>
+      </w:r>
+      <w:r>
+        <w:rPr>
+          <w:rStyle w:val="NormalTok"/>
+        </w:rPr>
+        <w:t xml:space="preserve"> </w:t>
+      </w:r>
+      <w:r>
+        <w:rPr>
+          <w:rStyle w:val="FunctionTok"/>
+        </w:rPr>
+        <w:t xml:space="preserve">posterior_summary</w:t>
+      </w:r>
+      <w:r>
+        <w:rPr>
+          <w:rStyle w:val="NormalTok"/>
+        </w:rPr>
+        <w:t xml:space="preserve">(x; digits</w:t>
+      </w:r>
+      <w:r>
+        <w:rPr>
+          <w:rStyle w:val="OperatorTok"/>
+        </w:rPr>
+        <w:t xml:space="preserve">=</w:t>
+      </w:r>
+      <w:r>
+        <w:rPr>
+          <w:rStyle w:val="FloatTok"/>
+        </w:rPr>
+        <w:t xml:space="preserve">4</w:t>
+      </w:r>
+      <w:r>
+        <w:rPr>
+          <w:rStyle w:val="NormalTok"/>
+        </w:rPr>
+        <w:t xml:space="preserve">)</w:t>
+      </w:r>
+      <w:r>
+        <w:br/>
+      </w:r>
+      <w:r>
+        <w:rPr>
+          <w:rStyle w:val="NormalTok"/>
+        </w:rPr>
+        <w:t xml:space="preserve">    (median </w:t>
+      </w:r>
+      <w:r>
+        <w:rPr>
+          <w:rStyle w:val="OperatorTok"/>
+        </w:rPr>
+        <w:t xml:space="preserve">=</w:t>
+      </w:r>
+      <w:r>
+        <w:rPr>
+          <w:rStyle w:val="NormalTok"/>
+        </w:rPr>
+        <w:t xml:space="preserve"> </w:t>
+      </w:r>
+      <w:r>
+        <w:rPr>
+          <w:rStyle w:val="FunctionTok"/>
+        </w:rPr>
+        <w:t xml:space="preserve">round</w:t>
+      </w:r>
+      <w:r>
+        <w:rPr>
+          <w:rStyle w:val="NormalTok"/>
+        </w:rPr>
+        <w:t xml:space="preserve">(</w:t>
+      </w:r>
+      <w:r>
+        <w:rPr>
+          <w:rStyle w:val="FunctionTok"/>
+        </w:rPr>
+        <w:t xml:space="preserve">median</w:t>
+      </w:r>
+      <w:r>
+        <w:rPr>
+          <w:rStyle w:val="NormalTok"/>
+        </w:rPr>
+        <w:t xml:space="preserve">(x); digits</w:t>
+      </w:r>
+      <w:r>
+        <w:rPr>
+          <w:rStyle w:val="OperatorTok"/>
+        </w:rPr>
+        <w:t xml:space="preserve">=</w:t>
+      </w:r>
+      <w:r>
+        <w:rPr>
+          <w:rStyle w:val="NormalTok"/>
+        </w:rPr>
+        <w:t xml:space="preserve">digits),</w:t>
+      </w:r>
+      <w:r>
+        <w:br/>
+      </w:r>
+      <w:r>
+        <w:rPr>
+          <w:rStyle w:val="NormalTok"/>
+        </w:rPr>
+        <w:t xml:space="preserve">     mean   </w:t>
+      </w:r>
+      <w:r>
+        <w:rPr>
+          <w:rStyle w:val="OperatorTok"/>
+        </w:rPr>
+        <w:t xml:space="preserve">=</w:t>
+      </w:r>
+      <w:r>
+        <w:rPr>
+          <w:rStyle w:val="NormalTok"/>
+        </w:rPr>
+        <w:t xml:space="preserve"> </w:t>
+      </w:r>
+      <w:r>
+        <w:rPr>
+          <w:rStyle w:val="FunctionTok"/>
+        </w:rPr>
+        <w:t xml:space="preserve">round</w:t>
+      </w:r>
+      <w:r>
+        <w:rPr>
+          <w:rStyle w:val="NormalTok"/>
+        </w:rPr>
+        <w:t xml:space="preserve">(</w:t>
+      </w:r>
+      <w:r>
+        <w:rPr>
+          <w:rStyle w:val="FunctionTok"/>
+        </w:rPr>
+        <w:t xml:space="preserve">mean</w:t>
+      </w:r>
+      <w:r>
+        <w:rPr>
+          <w:rStyle w:val="NormalTok"/>
+        </w:rPr>
+        <w:t xml:space="preserve">(x);   digits</w:t>
+      </w:r>
+      <w:r>
+        <w:rPr>
+          <w:rStyle w:val="OperatorTok"/>
+        </w:rPr>
+        <w:t xml:space="preserve">=</w:t>
+      </w:r>
+      <w:r>
+        <w:rPr>
+          <w:rStyle w:val="NormalTok"/>
+        </w:rPr>
+        <w:t xml:space="preserve">digits),</w:t>
+      </w:r>
+      <w:r>
+        <w:br/>
+      </w:r>
+      <w:r>
+        <w:rPr>
+          <w:rStyle w:val="NormalTok"/>
+        </w:rPr>
+        <w:t xml:space="preserve">     q025   </w:t>
+      </w:r>
+      <w:r>
+        <w:rPr>
+          <w:rStyle w:val="OperatorTok"/>
+        </w:rPr>
+        <w:t xml:space="preserve">=</w:t>
+      </w:r>
+      <w:r>
+        <w:rPr>
+          <w:rStyle w:val="NormalTok"/>
+        </w:rPr>
+        <w:t xml:space="preserve"> </w:t>
+      </w:r>
+      <w:r>
+        <w:rPr>
+          <w:rStyle w:val="FunctionTok"/>
+        </w:rPr>
+        <w:t xml:space="preserve">round</w:t>
+      </w:r>
+      <w:r>
+        <w:rPr>
+          <w:rStyle w:val="NormalTok"/>
+        </w:rPr>
+        <w:t xml:space="preserve">(</w:t>
+      </w:r>
+      <w:r>
+        <w:rPr>
+          <w:rStyle w:val="FunctionTok"/>
+        </w:rPr>
+        <w:t xml:space="preserve">quantile</w:t>
+      </w:r>
+      <w:r>
+        <w:rPr>
+          <w:rStyle w:val="NormalTok"/>
+        </w:rPr>
+        <w:t xml:space="preserve">(x, </w:t>
+      </w:r>
+      <w:r>
+        <w:rPr>
+          <w:rStyle w:val="FloatTok"/>
+        </w:rPr>
+        <w:t xml:space="preserve">0.025</w:t>
+      </w:r>
+      <w:r>
+        <w:rPr>
+          <w:rStyle w:val="NormalTok"/>
+        </w:rPr>
+        <w:t xml:space="preserve">); digits</w:t>
+      </w:r>
+      <w:r>
+        <w:rPr>
+          <w:rStyle w:val="OperatorTok"/>
+        </w:rPr>
+        <w:t xml:space="preserve">=</w:t>
+      </w:r>
+      <w:r>
+        <w:rPr>
+          <w:rStyle w:val="NormalTok"/>
+        </w:rPr>
+        <w:t xml:space="preserve">digits),</w:t>
+      </w:r>
+      <w:r>
+        <w:br/>
+      </w:r>
+      <w:r>
+        <w:rPr>
+          <w:rStyle w:val="NormalTok"/>
+        </w:rPr>
+        <w:t xml:space="preserve">     q975   </w:t>
+      </w:r>
+      <w:r>
+        <w:rPr>
+          <w:rStyle w:val="OperatorTok"/>
+        </w:rPr>
+        <w:t xml:space="preserve">=</w:t>
+      </w:r>
+      <w:r>
+        <w:rPr>
+          <w:rStyle w:val="NormalTok"/>
+        </w:rPr>
+        <w:t xml:space="preserve"> </w:t>
+      </w:r>
+      <w:r>
+        <w:rPr>
+          <w:rStyle w:val="FunctionTok"/>
+        </w:rPr>
+        <w:t xml:space="preserve">round</w:t>
+      </w:r>
+      <w:r>
+        <w:rPr>
+          <w:rStyle w:val="NormalTok"/>
+        </w:rPr>
+        <w:t xml:space="preserve">(</w:t>
+      </w:r>
+      <w:r>
+        <w:rPr>
+          <w:rStyle w:val="FunctionTok"/>
+        </w:rPr>
+        <w:t xml:space="preserve">quantile</w:t>
+      </w:r>
+      <w:r>
+        <w:rPr>
+          <w:rStyle w:val="NormalTok"/>
+        </w:rPr>
+        <w:t xml:space="preserve">(x, </w:t>
+      </w:r>
+      <w:r>
+        <w:rPr>
+          <w:rStyle w:val="FloatTok"/>
+        </w:rPr>
+        <w:t xml:space="preserve">0.975</w:t>
+      </w:r>
+      <w:r>
+        <w:rPr>
+          <w:rStyle w:val="NormalTok"/>
+        </w:rPr>
+        <w:t xml:space="preserve">); digits</w:t>
+      </w:r>
+      <w:r>
+        <w:rPr>
+          <w:rStyle w:val="OperatorTok"/>
+        </w:rPr>
+        <w:t xml:space="preserve">=</w:t>
+      </w:r>
+      <w:r>
+        <w:rPr>
+          <w:rStyle w:val="NormalTok"/>
+        </w:rPr>
+        <w:t xml:space="preserve">digits))</w:t>
+      </w:r>
+      <w:r>
+        <w:br/>
+      </w:r>
+      <w:r>
+        <w:rPr>
+          <w:rStyle w:val="KeywordTok"/>
+        </w:rPr>
+        <w:t xml:space="preserve">end</w:t>
+      </w:r>
+      <w:r>
+        <w:br/>
+      </w:r>
+      <w:r>
+        <w:br/>
+      </w:r>
+      <w:r>
+        <w:rPr>
+          <w:rStyle w:val="NormalTok"/>
+        </w:rPr>
+        <w:t xml:space="preserve">posterior_table </w:t>
+      </w:r>
+      <w:r>
+        <w:rPr>
+          <w:rStyle w:val="OperatorTok"/>
+        </w:rPr>
+        <w:t xml:space="preserve">=</w:t>
+      </w:r>
+      <w:r>
+        <w:rPr>
+          <w:rStyle w:val="NormalTok"/>
+        </w:rPr>
+        <w:t xml:space="preserve"> (</w:t>
+      </w:r>
+      <w:r>
+        <w:br/>
+      </w:r>
+      <w:r>
+        <w:rPr>
+          <w:rStyle w:val="NormalTok"/>
+        </w:rPr>
+        <w:t xml:space="preserve">    N         </w:t>
+      </w:r>
+      <w:r>
+        <w:rPr>
+          <w:rStyle w:val="OperatorTok"/>
+        </w:rPr>
+        <w:t xml:space="preserve">=</w:t>
+      </w:r>
+      <w:r>
+        <w:rPr>
+          <w:rStyle w:val="NormalTok"/>
+        </w:rPr>
+        <w:t xml:space="preserve"> </w:t>
+      </w:r>
+      <w:r>
+        <w:rPr>
+          <w:rStyle w:val="FunctionTok"/>
+        </w:rPr>
+        <w:t xml:space="preserve">posterior_summary</w:t>
+      </w:r>
+      <w:r>
+        <w:rPr>
+          <w:rStyle w:val="NormalTok"/>
+        </w:rPr>
+        <w:t xml:space="preserve">(N_chain;        digits</w:t>
+      </w:r>
+      <w:r>
+        <w:rPr>
+          <w:rStyle w:val="OperatorTok"/>
+        </w:rPr>
+        <w:t xml:space="preserve">=</w:t>
+      </w:r>
+      <w:r>
+        <w:rPr>
+          <w:rStyle w:val="FloatTok"/>
+        </w:rPr>
+        <w:t xml:space="preserve">0</w:t>
+      </w:r>
+      <w:r>
+        <w:rPr>
+          <w:rStyle w:val="NormalTok"/>
+        </w:rPr>
+        <w:t xml:space="preserve">),</w:t>
+      </w:r>
+      <w:r>
+        <w:br/>
+      </w:r>
+      <w:r>
+        <w:rPr>
+          <w:rStyle w:val="NormalTok"/>
+        </w:rPr>
+        <w:t xml:space="preserve">    β         </w:t>
+      </w:r>
+      <w:r>
+        <w:rPr>
+          <w:rStyle w:val="OperatorTok"/>
+        </w:rPr>
+        <w:t xml:space="preserve">=</w:t>
+      </w:r>
+      <w:r>
+        <w:rPr>
+          <w:rStyle w:val="NormalTok"/>
+        </w:rPr>
+        <w:t xml:space="preserve"> </w:t>
+      </w:r>
+      <w:r>
+        <w:rPr>
+          <w:rStyle w:val="FunctionTok"/>
+        </w:rPr>
+        <w:t xml:space="preserve">posterior_summary</w:t>
+      </w:r>
+      <w:r>
+        <w:rPr>
+          <w:rStyle w:val="NormalTok"/>
+        </w:rPr>
+        <w:t xml:space="preserve">(β_chain;        digits</w:t>
+      </w:r>
+      <w:r>
+        <w:rPr>
+          <w:rStyle w:val="OperatorTok"/>
+        </w:rPr>
+        <w:t xml:space="preserve">=</w:t>
+      </w:r>
+      <w:r>
+        <w:rPr>
+          <w:rStyle w:val="FloatTok"/>
+        </w:rPr>
+        <w:t xml:space="preserve">4</w:t>
+      </w:r>
+      <w:r>
+        <w:rPr>
+          <w:rStyle w:val="NormalTok"/>
+        </w:rPr>
+        <w:t xml:space="preserve">),</w:t>
+      </w:r>
+      <w:r>
+        <w:br/>
+      </w:r>
+      <w:r>
+        <w:rPr>
+          <w:rStyle w:val="NormalTok"/>
+        </w:rPr>
+        <w:t xml:space="preserve">    γ         </w:t>
+      </w:r>
+      <w:r>
+        <w:rPr>
+          <w:rStyle w:val="OperatorTok"/>
+        </w:rPr>
+        <w:t xml:space="preserve">=</w:t>
+      </w:r>
+      <w:r>
+        <w:rPr>
+          <w:rStyle w:val="NormalTok"/>
+        </w:rPr>
+        <w:t xml:space="preserve"> </w:t>
+      </w:r>
+      <w:r>
+        <w:rPr>
+          <w:rStyle w:val="FunctionTok"/>
+        </w:rPr>
+        <w:t xml:space="preserve">posterior_summary</w:t>
+      </w:r>
+      <w:r>
+        <w:rPr>
+          <w:rStyle w:val="NormalTok"/>
+        </w:rPr>
+        <w:t xml:space="preserve">(γ_chain;        digits</w:t>
+      </w:r>
+      <w:r>
+        <w:rPr>
+          <w:rStyle w:val="OperatorTok"/>
+        </w:rPr>
+        <w:t xml:space="preserve">=</w:t>
+      </w:r>
+      <w:r>
+        <w:rPr>
+          <w:rStyle w:val="FloatTok"/>
+        </w:rPr>
+        <w:t xml:space="preserve">4</w:t>
+      </w:r>
+      <w:r>
+        <w:rPr>
+          <w:rStyle w:val="NormalTok"/>
+        </w:rPr>
+        <w:t xml:space="preserve">),</w:t>
+      </w:r>
+      <w:r>
+        <w:br/>
+      </w:r>
+      <w:r>
+        <w:rPr>
+          <w:rStyle w:val="NormalTok"/>
+        </w:rPr>
+        <w:t xml:space="preserve">    ρ         </w:t>
+      </w:r>
+      <w:r>
+        <w:rPr>
+          <w:rStyle w:val="OperatorTok"/>
+        </w:rPr>
+        <w:t xml:space="preserve">=</w:t>
+      </w:r>
+      <w:r>
+        <w:rPr>
+          <w:rStyle w:val="NormalTok"/>
+        </w:rPr>
+        <w:t xml:space="preserve"> </w:t>
+      </w:r>
+      <w:r>
+        <w:rPr>
+          <w:rStyle w:val="FunctionTok"/>
+        </w:rPr>
+        <w:t xml:space="preserve">posterior_summary</w:t>
+      </w:r>
+      <w:r>
+        <w:rPr>
+          <w:rStyle w:val="NormalTok"/>
+        </w:rPr>
+        <w:t xml:space="preserve">(ρ_chain;        digits</w:t>
+      </w:r>
+      <w:r>
+        <w:rPr>
+          <w:rStyle w:val="OperatorTok"/>
+        </w:rPr>
+        <w:t xml:space="preserve">=</w:t>
+      </w:r>
+      <w:r>
+        <w:rPr>
+          <w:rStyle w:val="FloatTok"/>
+        </w:rPr>
+        <w:t xml:space="preserve">5</w:t>
+      </w:r>
+      <w:r>
+        <w:rPr>
+          <w:rStyle w:val="NormalTok"/>
+        </w:rPr>
+        <w:t xml:space="preserve">),</w:t>
+      </w:r>
+      <w:r>
+        <w:br/>
+      </w:r>
+      <w:r>
+        <w:rPr>
+          <w:rStyle w:val="NormalTok"/>
+        </w:rPr>
+        <w:t xml:space="preserve">    R0        </w:t>
+      </w:r>
+      <w:r>
+        <w:rPr>
+          <w:rStyle w:val="OperatorTok"/>
+        </w:rPr>
+        <w:t xml:space="preserve">=</w:t>
+      </w:r>
+      <w:r>
+        <w:rPr>
+          <w:rStyle w:val="NormalTok"/>
+        </w:rPr>
+        <w:t xml:space="preserve"> </w:t>
+      </w:r>
+      <w:r>
+        <w:rPr>
+          <w:rStyle w:val="FunctionTok"/>
+        </w:rPr>
+        <w:t xml:space="preserve">posterior_summary</w:t>
+      </w:r>
+      <w:r>
+        <w:rPr>
+          <w:rStyle w:val="NormalTok"/>
+        </w:rPr>
+        <w:t xml:space="preserve">(R0_chain;       digits</w:t>
+      </w:r>
+      <w:r>
+        <w:rPr>
+          <w:rStyle w:val="OperatorTok"/>
+        </w:rPr>
+        <w:t xml:space="preserve">=</w:t>
+      </w:r>
+      <w:r>
+        <w:rPr>
+          <w:rStyle w:val="FloatTok"/>
+        </w:rPr>
+        <w:t xml:space="preserve">3</w:t>
+      </w:r>
+      <w:r>
+        <w:rPr>
+          <w:rStyle w:val="NormalTok"/>
+        </w:rPr>
+        <w:t xml:space="preserve">),</w:t>
+      </w:r>
+      <w:r>
+        <w:br/>
+      </w:r>
+      <w:r>
+        <w:rPr>
+          <w:rStyle w:val="NormalTok"/>
+        </w:rPr>
+        <w:t xml:space="preserve">    IP_steps  </w:t>
+      </w:r>
+      <w:r>
+        <w:rPr>
+          <w:rStyle w:val="OperatorTok"/>
+        </w:rPr>
+        <w:t xml:space="preserve">=</w:t>
+      </w:r>
+      <w:r>
+        <w:rPr>
+          <w:rStyle w:val="NormalTok"/>
+        </w:rPr>
+        <w:t xml:space="preserve"> </w:t>
+      </w:r>
+      <w:r>
+        <w:rPr>
+          <w:rStyle w:val="FunctionTok"/>
+        </w:rPr>
+        <w:t xml:space="preserve">posterior_summary</w:t>
+      </w:r>
+      <w:r>
+        <w:rPr>
+          <w:rStyle w:val="NormalTok"/>
+        </w:rPr>
+        <w:t xml:space="preserve">(IP_steps_chain; digits</w:t>
+      </w:r>
+      <w:r>
+        <w:rPr>
+          <w:rStyle w:val="OperatorTok"/>
+        </w:rPr>
+        <w:t xml:space="preserve">=</w:t>
+      </w:r>
+      <w:r>
+        <w:rPr>
+          <w:rStyle w:val="FloatTok"/>
+        </w:rPr>
+        <w:t xml:space="preserve">2</w:t>
+      </w:r>
+      <w:r>
+        <w:rPr>
+          <w:rStyle w:val="NormalTok"/>
+        </w:rPr>
+        <w:t xml:space="preserve">),</w:t>
+      </w:r>
+      <w:r>
+        <w:br/>
+      </w:r>
+      <w:r>
+        <w:rPr>
+          <w:rStyle w:val="NormalTok"/>
+        </w:rPr>
+        <w:t xml:space="preserve">    I0        </w:t>
+      </w:r>
+      <w:r>
+        <w:rPr>
+          <w:rStyle w:val="OperatorTok"/>
+        </w:rPr>
+        <w:t xml:space="preserve">=</w:t>
+      </w:r>
+      <w:r>
+        <w:rPr>
+          <w:rStyle w:val="NormalTok"/>
+        </w:rPr>
+        <w:t xml:space="preserve"> </w:t>
+      </w:r>
+      <w:r>
+        <w:rPr>
+          <w:rStyle w:val="FunctionTok"/>
+        </w:rPr>
+        <w:t xml:space="preserve">posterior_summary</w:t>
+      </w:r>
+      <w:r>
+        <w:rPr>
+          <w:rStyle w:val="NormalTok"/>
+        </w:rPr>
+        <w:t xml:space="preserve">(I0_chain;       digits</w:t>
+      </w:r>
+      <w:r>
+        <w:rPr>
+          <w:rStyle w:val="OperatorTok"/>
+        </w:rPr>
+        <w:t xml:space="preserve">=</w:t>
+      </w:r>
+      <w:r>
+        <w:rPr>
+          <w:rStyle w:val="FloatTok"/>
+        </w:rPr>
+        <w:t xml:space="preserve">2</w:t>
+      </w:r>
+      <w:r>
+        <w:rPr>
+          <w:rStyle w:val="NormalTok"/>
+        </w:rPr>
+        <w:t xml:space="preserve">),</w:t>
+      </w:r>
+      <w:r>
+        <w:br/>
+      </w:r>
+      <w:r>
+        <w:rPr>
+          <w:rStyle w:val="NormalTok"/>
+        </w:rPr>
+        <w:t xml:space="preserve">    K_over_N  </w:t>
+      </w:r>
+      <w:r>
+        <w:rPr>
+          <w:rStyle w:val="OperatorTok"/>
+        </w:rPr>
+        <w:t xml:space="preserve">=</w:t>
+      </w:r>
+      <w:r>
+        <w:rPr>
+          <w:rStyle w:val="NormalTok"/>
+        </w:rPr>
+        <w:t xml:space="preserve"> </w:t>
+      </w:r>
+      <w:r>
+        <w:rPr>
+          <w:rStyle w:val="FunctionTok"/>
+        </w:rPr>
+        <w:t xml:space="preserve">posterior_summary</w:t>
+      </w:r>
+      <w:r>
+        <w:rPr>
+          <w:rStyle w:val="NormalTok"/>
+        </w:rPr>
+        <w:t xml:space="preserve">(tau_chain;      digits</w:t>
+      </w:r>
+      <w:r>
+        <w:rPr>
+          <w:rStyle w:val="OperatorTok"/>
+        </w:rPr>
+        <w:t xml:space="preserve">=</w:t>
+      </w:r>
+      <w:r>
+        <w:rPr>
+          <w:rStyle w:val="FloatTok"/>
+        </w:rPr>
+        <w:t xml:space="preserve">4</w:t>
+      </w:r>
+      <w:r>
+        <w:rPr>
+          <w:rStyle w:val="NormalTok"/>
+        </w:rPr>
+        <w:t xml:space="preserve">),</w:t>
+      </w:r>
+      <w:r>
+        <w:br/>
+      </w:r>
+      <w:r>
+        <w:rPr>
+          <w:rStyle w:val="NormalTok"/>
+        </w:rPr>
+        <w:t xml:space="preserve">)</w:t>
+      </w:r>
+    </w:p>
+    <w:p>
+      <w:pPr>
+        <w:pStyle w:val="SourceCode"/>
+      </w:pPr>
+      <w:r>
+        <w:rPr>
           <w:rStyle w:val="VerbatimChar"/>
         </w:rPr>
-        <w:t xml:space="preserve">Parameter Estimates — Wave 1 (all records, posterior means with 95% CI):</w:t>
-      </w:r>
-      <w:r>
-        <w:br/>
-      </w:r>
+        <w:t xml:space="preserve">(N = (median = 5031.0, mean = 5061.0, q025 = 4342.0, q975 = 5931.0), β = (median = 0.1903, mean = 0.1904, q025 = 0.1786, q975 = 0.2025), γ = (median = 0.1851, mean = 0.1853, q025 = 0.1715, q975 = 0.1998), ρ = (median = 0.00022, mean = 0.00022, q025 = 0.00017, q975 = 0.00027), R0 = (median = 1.126, mean = 1.126, q025 = 1.11, q975 = 1.143), IP_steps = (median = 5.92, mean = 5.92, q025 = 5.52, q975 = 6.35), I0 = (median = 1.09, mean = 1.1, q025 = 0.77, q975 = 1.5), K_over_N = (median = 0.1803, mean = 0.1804, q025 = 0.1529, q975 = 0.2089))</w:t>
+      </w:r>
+    </w:p>
+    <w:p>
+      <w:pPr>
+        <w:pStyle w:val="SourceCode"/>
+      </w:pPr>
       <w:r>
         <w:rPr>
           <w:rStyle w:val="VerbatimChar"/>
         </w:rPr>
-        <w:t xml:space="preserve">β:      0.19 [0.179, 0.202]  (Vossler et al.: 0.190)</w:t>
+        <w:t xml:space="preserve">N           median = 5031.0   mean = 5061.0   95% CI = [4342.0, 5931.0]</w:t>
       </w:r>
       <w:r>
         <w:br/>
@@ -9245,7 +10560,7 @@
         <w:rPr>
           <w:rStyle w:val="VerbatimChar"/>
         </w:rPr>
-        <w:t xml:space="preserve">γ:      0.185 [0.171, 0.2]  (Vossler et al.: 0.169)</w:t>
+        <w:t xml:space="preserve">β           median = 0.1903   mean = 0.1904   95% CI = [0.1786, 0.2025]</w:t>
       </w:r>
       <w:r>
         <w:br/>
@@ -9254,7 +10569,7 @@
         <w:rPr>
           <w:rStyle w:val="VerbatimChar"/>
         </w:rPr>
-        <w:t xml:space="preserve">pγ=1-e⁻ᵞ: 0.169</w:t>
+        <w:t xml:space="preserve">γ           median = 0.1851   mean = 0.1853   95% CI = [0.1715, 0.1998]</w:t>
       </w:r>
       <w:r>
         <w:br/>
@@ -9263,7 +10578,7 @@
         <w:rPr>
           <w:rStyle w:val="VerbatimChar"/>
         </w:rPr>
-        <w:t xml:space="preserve">ρ:      0.00022 [0.00017, 0.00027]  (Vossler et al.: 0.00021)</w:t>
+        <w:t xml:space="preserve">ρ           median = 0.00022   mean = 0.00022   95% CI = [0.00017, 0.00027]</w:t>
       </w:r>
       <w:r>
         <w:br/>
@@ -9272,7 +10587,7 @@
         <w:rPr>
           <w:rStyle w:val="VerbatimChar"/>
         </w:rPr>
-        <w:t xml:space="preserve">N:      5061.0 [4342.0, 5931.0]</w:t>
+        <w:t xml:space="preserve">R0          median = 1.126   mean = 1.126   95% CI = [1.11, 1.143]</w:t>
       </w:r>
       <w:r>
         <w:br/>
@@ -9281,7 +10596,7 @@
         <w:rPr>
           <w:rStyle w:val="VerbatimChar"/>
         </w:rPr>
-        <w:t xml:space="preserve">I₀=ρ·N:  1.1 [0.8, 1.5]  (implied initial infected)</w:t>
+        <w:t xml:space="preserve">IP_steps    median = 5.92   mean = 5.92   95% CI = [5.52, 6.35]</w:t>
       </w:r>
       <w:r>
         <w:br/>
@@ -9290,7 +10605,7 @@
         <w:rPr>
           <w:rStyle w:val="VerbatimChar"/>
         </w:rPr>
-        <w:t xml:space="preserve">R₀=β/pγ: 1.126  (Vossler et al. β/γ: 1.124)</w:t>
+        <w:t xml:space="preserve">I0          median = 1.09   mean = 1.1   95% CI = [0.77, 1.5]</w:t>
       </w:r>
       <w:r>
         <w:br/>
@@ -9299,7 +10614,28 @@
         <w:rPr>
           <w:rStyle w:val="VerbatimChar"/>
         </w:rPr>
-        <w:t xml:space="preserve">mean IP=1/pγ: 5.91 days  (Vossler et al. 1/γ: 5.9 d)</w:t>
+        <w:t xml:space="preserve">K_over_N    median = 0.1803   mean = 0.1804   95% CI = [0.1529, 0.2089]</w:t>
+      </w:r>
+      <w:r>
+        <w:br/>
+      </w:r>
+      <w:r>
+        <w:br/>
+      </w:r>
+      <w:r>
+        <w:rPr>
+          <w:rStyle w:val="VerbatimChar"/>
+        </w:rPr>
+        <w:t xml:space="preserve">Vossler et al. (2022) Wave 1 reference (continuous-time, β/γ):</w:t>
+      </w:r>
+      <w:r>
+        <w:br/>
+      </w:r>
+      <w:r>
+        <w:rPr>
+          <w:rStyle w:val="VerbatimChar"/>
+        </w:rPr>
+        <w:t xml:space="preserve">  β = 0.190, γ = 0.169, ρ = 0.00021, β/γ = 1.124, 1/γ = 5.9 d</w:t>
       </w:r>
     </w:p>
     <w:bookmarkEnd w:id="37"/>
@@ -9810,14 +11146,14 @@
       <w:r>
         <w:drawing>
           <wp:inline>
-            <wp:extent cx="5029200" cy="3200400"/>
+            <wp:extent cx="5334000" cy="3810000"/>
             <wp:effectExtent b="0" l="0" r="0" t="0"/>
             <wp:docPr descr="" title="" id="39" name="Picture"/>
             <a:graphic>
               <a:graphicData uri="http://schemas.openxmlformats.org/drawingml/2006/picture">
                 <pic:pic>
                   <pic:nvPicPr>
-                    <pic:cNvPr descr="DSA_turing_SIRmap_W1_files/figure-docx/cell-20-output-1.svg" id="40" name="Picture"/>
+                    <pic:cNvPr descr="DSA_turing_SIRmap_W1_files/figure-docx/cell-21-output-1.svg" id="40" name="Picture"/>
                     <pic:cNvPicPr>
                       <a:picLocks noChangeArrowheads="1" noChangeAspect="1"/>
                     </pic:cNvPicPr>
@@ -9840,7 +11176,7 @@
                   <pic:spPr bwMode="auto">
                     <a:xfrm>
                       <a:off x="0" y="0"/>
-                      <a:ext cx="5029200" cy="3200400"/>
+                      <a:ext cx="5334000" cy="3810000"/>
                     </a:xfrm>
                     <a:prstGeom prst="rect">
                       <a:avLst/>
@@ -10953,7 +12289,7 @@
               <a:graphicData uri="http://schemas.openxmlformats.org/drawingml/2006/picture">
                 <pic:pic>
                   <pic:nvPicPr>
-                    <pic:cNvPr descr="DSA_turing_SIRmap_W1_files/figure-docx/cell-21-output-1.svg" id="45" name="Picture"/>
+                    <pic:cNvPr descr="DSA_turing_SIRmap_W1_files/figure-docx/cell-22-output-1.svg" id="45" name="Picture"/>
                     <pic:cNvPicPr>
                       <a:picLocks noChangeArrowheads="1" noChangeAspect="1"/>
                     </pic:cNvPicPr>

</xml_diff>

<commit_message>
Added CrI and medians on Ebola case study
</commit_message>
<xml_diff>
--- a/Ebola_DRC_2018/DSA_turing_SIRmap_W1.docx
+++ b/Ebola_DRC_2018/DSA_turing_SIRmap_W1.docx
@@ -7547,7 +7547,7 @@
         <w:rPr>
           <w:rStyle w:val="VerbatimChar"/>
         </w:rPr>
-        <w:t xml:space="preserve">Wall duration     = 1906.1 seconds</w:t>
+        <w:t xml:space="preserve">Wall duration     = 1847.23 seconds</w:t>
       </w:r>
       <w:r>
         <w:br/>
@@ -7556,7 +7556,7 @@
         <w:rPr>
           <w:rStyle w:val="VerbatimChar"/>
         </w:rPr>
-        <w:t xml:space="preserve">Compute duration  = 5148.76 seconds</w:t>
+        <w:t xml:space="preserve">Compute duration  = 4986.69 seconds</w:t>
       </w:r>
       <w:r>
         <w:br/>
@@ -11594,7 +11594,7 @@
         <w:rPr>
           <w:rStyle w:val="NormalTok"/>
         </w:rPr>
-        <w:t xml:space="preserve">f_lower </w:t>
+        <w:t xml:space="preserve">f_median </w:t>
       </w:r>
       <w:r>
         <w:rPr>
@@ -11636,6 +11636,93 @@
         <w:rPr>
           <w:rStyle w:val="FloatTok"/>
         </w:rPr>
+        <w:t xml:space="preserve">0.5</w:t>
+      </w:r>
+      <w:r>
+        <w:rPr>
+          <w:rStyle w:val="NormalTok"/>
+        </w:rPr>
+        <w:t xml:space="preserve">)   for t </w:t>
+      </w:r>
+      <w:r>
+        <w:rPr>
+          <w:rStyle w:val="KeywordTok"/>
+        </w:rPr>
+        <w:t xml:space="preserve">in</w:t>
+      </w:r>
+      <w:r>
+        <w:rPr>
+          <w:rStyle w:val="NormalTok"/>
+        </w:rPr>
+        <w:t xml:space="preserve"> </w:t>
+      </w:r>
+      <w:r>
+        <w:rPr>
+          <w:rStyle w:val="FloatTok"/>
+        </w:rPr>
+        <w:t xml:space="preserve">1</w:t>
+      </w:r>
+      <w:r>
+        <w:rPr>
+          <w:rStyle w:val="OperatorTok"/>
+        </w:rPr>
+        <w:t xml:space="preserve">:</w:t>
+      </w:r>
+      <w:r>
+        <w:rPr>
+          <w:rStyle w:val="NormalTok"/>
+        </w:rPr>
+        <w:t xml:space="preserve">nsteps]</w:t>
+      </w:r>
+      <w:r>
+        <w:br/>
+      </w:r>
+      <w:r>
+        <w:rPr>
+          <w:rStyle w:val="NormalTok"/>
+        </w:rPr>
+        <w:t xml:space="preserve">f_lower  </w:t>
+      </w:r>
+      <w:r>
+        <w:rPr>
+          <w:rStyle w:val="OperatorTok"/>
+        </w:rPr>
+        <w:t xml:space="preserve">=</w:t>
+      </w:r>
+      <w:r>
+        <w:rPr>
+          <w:rStyle w:val="NormalTok"/>
+        </w:rPr>
+        <w:t xml:space="preserve"> [</w:t>
+      </w:r>
+      <w:r>
+        <w:rPr>
+          <w:rStyle w:val="FunctionTok"/>
+        </w:rPr>
+        <w:t xml:space="preserve">quantile</w:t>
+      </w:r>
+      <w:r>
+        <w:rPr>
+          <w:rStyle w:val="NormalTok"/>
+        </w:rPr>
+        <w:t xml:space="preserve">(f_samples[t, </w:t>
+      </w:r>
+      <w:r>
+        <w:rPr>
+          <w:rStyle w:val="OperatorTok"/>
+        </w:rPr>
+        <w:t xml:space="preserve">:</w:t>
+      </w:r>
+      <w:r>
+        <w:rPr>
+          <w:rStyle w:val="NormalTok"/>
+        </w:rPr>
+        <w:t xml:space="preserve">], </w:t>
+      </w:r>
+      <w:r>
+        <w:rPr>
+          <w:rStyle w:val="FloatTok"/>
+        </w:rPr>
         <w:t xml:space="preserve">0.025</w:t>
       </w:r>
       <w:r>
@@ -11681,7 +11768,7 @@
         <w:rPr>
           <w:rStyle w:val="NormalTok"/>
         </w:rPr>
-        <w:t xml:space="preserve">f_upper </w:t>
+        <w:t xml:space="preserve">f_upper  </w:t>
       </w:r>
       <w:r>
         <w:rPr>
@@ -12107,7 +12194,7 @@
         <w:rPr>
           <w:rStyle w:val="StringTok"/>
         </w:rPr>
-        <w:t xml:space="preserve">"95% CI"</w:t>
+        <w:t xml:space="preserve">"95% CrI"</w:t>
       </w:r>
       <w:r>
         <w:rPr>
@@ -12164,7 +12251,7 @@
         <w:rPr>
           <w:rStyle w:val="NormalTok"/>
         </w:rPr>
-        <w:t xml:space="preserve">nsteps, f,</w:t>
+        <w:t xml:space="preserve">nsteps, f_median,</w:t>
       </w:r>
       <w:r>
         <w:br/>
@@ -12185,7 +12272,7 @@
         <w:rPr>
           <w:rStyle w:val="StringTok"/>
         </w:rPr>
-        <w:t xml:space="preserve">"Posterior mean"</w:t>
+        <w:t xml:space="preserve">"Posterior median"</w:t>
       </w:r>
       <w:r>
         <w:rPr>

</xml_diff>